<commit_message>
Resources: open up the one-pager layout
Content filled roughly 60 percent of the page and read as cramped. Increases
section spacing, card and feature padding, line height and body size so each
sheet uses the full page, and moves the hub URL onto its own line so it stops
wrapping mid-path.

Co-authored-by: Copilot <223556219+Copilot@users.noreply.github.com>
</commit_message>
<xml_diff>
--- a/Resources/Cowork Chargeback Power BI Report - Overview.docx
+++ b/Resources/Cowork Chargeback Power BI Report - Overview.docx
@@ -22,15 +22,15 @@
           <w:tcPr>
             <w:shd w:fill="101D3B" w:color="auto" w:val="clear"/>
             <w:tcMar>
-              <w:top w:type="dxa" w:w="210"/>
-              <w:left w:type="dxa" w:w="200"/>
-              <w:bottom w:type="dxa" w:w="210"/>
-              <w:right w:type="dxa" w:w="200"/>
+              <w:top w:type="dxa" w:w="330"/>
+              <w:left w:type="dxa" w:w="260"/>
+              <w:bottom w:type="dxa" w:w="330"/>
+              <w:right w:type="dxa" w:w="260"/>
             </w:tcMar>
           </w:tcPr>
           <w:p>
             <w:pPr>
-              <w:spacing w:after="30" w:before="0"/>
+              <w:spacing w:after="70" w:before="0"/>
             </w:pPr>
             <w:r>
               <w:rPr>
@@ -48,7 +48,7 @@
           </w:p>
           <w:p>
             <w:pPr>
-              <w:spacing w:after="20" w:before="0"/>
+              <w:spacing w:after="50" w:before="0"/>
             </w:pPr>
             <w:r>
               <w:rPr>
@@ -56,36 +56,36 @@
                 <w:b/>
                 <w:bCs/>
                 <w:color w:val="FFFFFF"/>
-                <w:sz w:val="40"/>
-                <w:szCs w:val="40"/>
+                <w:sz w:val="44"/>
+                <w:szCs w:val="44"/>
               </w:rPr>
               <w:t xml:space="preserve">Cowork Chargeback</w:t>
             </w:r>
           </w:p>
           <w:p>
             <w:pPr>
-              <w:spacing w:after="80" w:before="0"/>
+              <w:spacing w:after="160" w:before="0"/>
             </w:pPr>
             <w:r>
               <w:rPr>
                 <w:rFonts w:ascii="Arial" w:cs="Arial" w:eastAsia="Arial" w:hAnsi="Arial"/>
                 <w:color w:val="C7D6EE"/>
+                <w:sz w:val="22"/>
+                <w:szCs w:val="22"/>
+              </w:rPr>
+              <w:t xml:space="preserve">Power BI template (.pbit)</w:t>
+            </w:r>
+          </w:p>
+          <w:p>
+            <w:pPr>
+              <w:spacing w:after="230" w:before="0" w:line="300" w:lineRule="auto"/>
+            </w:pPr>
+            <w:r>
+              <w:rPr>
+                <w:rFonts w:ascii="Arial" w:cs="Arial" w:eastAsia="Arial" w:hAnsi="Arial"/>
+                <w:color w:val="E4EAF6"/>
                 <w:sz w:val="21"/>
                 <w:szCs w:val="21"/>
-              </w:rPr>
-              <w:t xml:space="preserve">Power BI template (.pbit)</w:t>
-            </w:r>
-          </w:p>
-          <w:p>
-            <w:pPr>
-              <w:spacing w:after="110" w:before="0" w:line="290" w:lineRule="auto"/>
-            </w:pPr>
-            <w:r>
-              <w:rPr>
-                <w:rFonts w:ascii="Arial" w:cs="Arial" w:eastAsia="Arial" w:hAnsi="Arial"/>
-                <w:color w:val="E4EAF6"/>
-                <w:sz w:val="20"/>
-                <w:szCs w:val="20"/>
               </w:rPr>
               <w:t xml:space="preserve">Attribute Copilot Cowork credits to the right department, then decide how to buy them — prepaid, pay-as-you-go, or hybrid — with a growth-rate forecast behind the number.</w:t>
             </w:r>
@@ -101,6 +101,7 @@
                 <w:insideH w:val="none" w:color="FFFFFF" w:sz="0"/>
                 <w:insideV w:val="none" w:color="FFFFFF" w:sz="0"/>
               </w:tblBorders>
+              <w:tblLayout w:type="fixed"/>
             </w:tblPr>
             <w:tblGrid>
               <w:gridCol w:w="3146"/>
@@ -118,15 +119,15 @@
                   </w:tcBorders>
                   <w:shd w:fill="101D3B" w:color="auto" w:val="clear"/>
                   <w:tcMar>
-                    <w:top w:type="dxa" w:w="100"/>
+                    <w:top w:type="dxa" w:w="190"/>
                     <w:left w:type="dxa" w:w="0"/>
-                    <w:bottom w:type="dxa" w:w="30"/>
-                    <w:right w:type="dxa" w:w="100"/>
+                    <w:bottom w:type="dxa" w:w="60"/>
+                    <w:right w:type="dxa" w:w="140"/>
                   </w:tcMar>
                 </w:tcPr>
                 <w:p>
                   <w:pPr>
-                    <w:spacing w:after="10" w:before="0"/>
+                    <w:spacing w:after="40" w:before="0"/>
                   </w:pPr>
                   <w:r>
                     <w:rPr>
@@ -134,8 +135,8 @@
                       <w:b/>
                       <w:bCs/>
                       <w:color w:val="FFFFFF"/>
-                      <w:sz w:val="23"/>
-                      <w:szCs w:val="23"/>
+                      <w:sz w:val="25"/>
+                      <w:szCs w:val="25"/>
                     </w:rPr>
                     <w:t xml:space="preserve">2 CSVs</w:t>
                   </w:r>
@@ -167,15 +168,15 @@
                   </w:tcBorders>
                   <w:shd w:fill="101D3B" w:color="auto" w:val="clear"/>
                   <w:tcMar>
-                    <w:top w:type="dxa" w:w="100"/>
+                    <w:top w:type="dxa" w:w="190"/>
                     <w:left w:type="dxa" w:w="0"/>
-                    <w:bottom w:type="dxa" w:w="30"/>
-                    <w:right w:type="dxa" w:w="100"/>
+                    <w:bottom w:type="dxa" w:w="60"/>
+                    <w:right w:type="dxa" w:w="140"/>
                   </w:tcMar>
                 </w:tcPr>
                 <w:p>
                   <w:pPr>
-                    <w:spacing w:after="10" w:before="0"/>
+                    <w:spacing w:after="40" w:before="0"/>
                   </w:pPr>
                   <w:r>
                     <w:rPr>
@@ -183,8 +184,8 @@
                       <w:b/>
                       <w:bCs/>
                       <w:color w:val="FFFFFF"/>
-                      <w:sz w:val="23"/>
-                      <w:szCs w:val="23"/>
+                      <w:sz w:val="25"/>
+                      <w:szCs w:val="25"/>
                     </w:rPr>
                     <w:t xml:space="preserve">6</w:t>
                   </w:r>
@@ -216,15 +217,15 @@
                   </w:tcBorders>
                   <w:shd w:fill="101D3B" w:color="auto" w:val="clear"/>
                   <w:tcMar>
-                    <w:top w:type="dxa" w:w="100"/>
+                    <w:top w:type="dxa" w:w="190"/>
                     <w:left w:type="dxa" w:w="0"/>
-                    <w:bottom w:type="dxa" w:w="30"/>
-                    <w:right w:type="dxa" w:w="100"/>
+                    <w:bottom w:type="dxa" w:w="60"/>
+                    <w:right w:type="dxa" w:w="140"/>
                   </w:tcMar>
                 </w:tcPr>
                 <w:p>
                   <w:pPr>
-                    <w:spacing w:after="10" w:before="0"/>
+                    <w:spacing w:after="40" w:before="0"/>
                   </w:pPr>
                   <w:r>
                     <w:rPr>
@@ -232,8 +233,8 @@
                       <w:b/>
                       <w:bCs/>
                       <w:color w:val="FFFFFF"/>
-                      <w:sz w:val="23"/>
-                      <w:szCs w:val="23"/>
+                      <w:sz w:val="25"/>
+                      <w:szCs w:val="25"/>
                     </w:rPr>
                     <w:t xml:space="preserve">0</w:t>
                   </w:r>
@@ -263,7 +264,7 @@
     </w:tbl>
     <w:p>
       <w:pPr>
-        <w:spacing w:after="40" w:before="150"/>
+        <w:spacing w:after="130" w:before="420"/>
       </w:pPr>
       <w:r>
         <w:rPr>
@@ -273,8 +274,8 @@
           <w:caps/>
           <w:color w:val="0A3FB0"/>
           <w:spacing w:val="30"/>
-          <w:sz w:val="15"/>
-          <w:szCs w:val="15"/>
+          <w:sz w:val="16"/>
+          <w:szCs w:val="16"/>
         </w:rPr>
         <w:t xml:space="preserve">What to load</w:t>
       </w:r>
@@ -307,15 +308,15 @@
               <w:right w:val="single" w:color="E3E9F2" w:sz="6"/>
             </w:tcBorders>
             <w:tcMar>
-              <w:top w:type="dxa" w:w="100"/>
-              <w:left w:type="dxa" w:w="120"/>
-              <w:bottom w:type="dxa" w:w="100"/>
-              <w:right w:type="dxa" w:w="120"/>
+              <w:top w:type="dxa" w:w="210"/>
+              <w:left w:type="dxa" w:w="200"/>
+              <w:bottom w:type="dxa" w:w="210"/>
+              <w:right w:type="dxa" w:w="200"/>
             </w:tcMar>
           </w:tcPr>
           <w:p>
             <w:pPr>
-              <w:spacing w:after="30" w:before="0"/>
+              <w:spacing w:after="90" w:before="0"/>
             </w:pPr>
             <w:r>
               <w:rPr>
@@ -323,8 +324,8 @@
                 <w:b/>
                 <w:bCs/>
                 <w:color w:val="0F1720"/>
-                <w:sz w:val="19"/>
-                <w:szCs w:val="19"/>
+                <w:sz w:val="20"/>
+                <w:szCs w:val="20"/>
               </w:rPr>
               <w:t xml:space="preserve">Entra user export(s)</w:t>
             </w:r>
@@ -334,22 +335,22 @@
                 <w:b/>
                 <w:bCs/>
                 <w:color w:val="0A3FB0"/>
-                <w:sz w:val="15"/>
-                <w:szCs w:val="15"/>
+                <w:sz w:val="16"/>
+                <w:szCs w:val="16"/>
               </w:rPr>
               <w:t xml:space="preserve">  ·  CSV</w:t>
             </w:r>
           </w:p>
           <w:p>
             <w:pPr>
-              <w:spacing w:after="0" w:before="0" w:line="240" w:lineRule="auto"/>
+              <w:spacing w:after="0" w:before="0" w:line="280" w:lineRule="auto"/>
             </w:pPr>
             <w:r>
               <w:rPr>
                 <w:rFonts w:ascii="Arial" w:cs="Arial" w:eastAsia="Arial" w:hAnsi="Arial"/>
                 <w:color w:val="55637A"/>
-                <w:sz w:val="17"/>
-                <w:szCs w:val="17"/>
+                <w:sz w:val="18"/>
+                <w:szCs w:val="18"/>
               </w:rPr>
               <w:t xml:space="preserve">Department, cost center, business unit and job title, used to allocate each person to a unit. Multiple files allowed.</w:t>
             </w:r>
@@ -365,15 +366,15 @@
               <w:right w:val="single" w:color="E3E9F2" w:sz="6"/>
             </w:tcBorders>
             <w:tcMar>
-              <w:top w:type="dxa" w:w="100"/>
-              <w:left w:type="dxa" w:w="120"/>
-              <w:bottom w:type="dxa" w:w="100"/>
-              <w:right w:type="dxa" w:w="120"/>
+              <w:top w:type="dxa" w:w="210"/>
+              <w:left w:type="dxa" w:w="200"/>
+              <w:bottom w:type="dxa" w:w="210"/>
+              <w:right w:type="dxa" w:w="200"/>
             </w:tcMar>
           </w:tcPr>
           <w:p>
             <w:pPr>
-              <w:spacing w:after="30" w:before="0"/>
+              <w:spacing w:after="90" w:before="0"/>
             </w:pPr>
             <w:r>
               <w:rPr>
@@ -381,8 +382,8 @@
                 <w:b/>
                 <w:bCs/>
                 <w:color w:val="0F1720"/>
-                <w:sz w:val="19"/>
-                <w:szCs w:val="19"/>
+                <w:sz w:val="20"/>
+                <w:szCs w:val="20"/>
               </w:rPr>
               <w:t xml:space="preserve">Copilot credit / Cost Management export</w:t>
             </w:r>
@@ -392,22 +393,22 @@
                 <w:b/>
                 <w:bCs/>
                 <w:color w:val="0A3FB0"/>
-                <w:sz w:val="15"/>
-                <w:szCs w:val="15"/>
+                <w:sz w:val="16"/>
+                <w:szCs w:val="16"/>
               </w:rPr>
               <w:t xml:space="preserve">  ·  CSV</w:t>
             </w:r>
           </w:p>
           <w:p>
             <w:pPr>
-              <w:spacing w:after="0" w:before="0" w:line="240" w:lineRule="auto"/>
+              <w:spacing w:after="0" w:before="0" w:line="280" w:lineRule="auto"/>
             </w:pPr>
             <w:r>
               <w:rPr>
                 <w:rFonts w:ascii="Arial" w:cs="Arial" w:eastAsia="Arial" w:hAnsi="Arial"/>
                 <w:color w:val="55637A"/>
-                <w:sz w:val="17"/>
-                <w:szCs w:val="17"/>
+                <w:sz w:val="18"/>
+                <w:szCs w:val="18"/>
               </w:rPr>
               <w:t xml:space="preserve">One row per user with the credits they consumed, priced to dollars at your contracted rate.</w:t>
             </w:r>
@@ -417,7 +418,7 @@
     </w:tbl>
     <w:p>
       <w:pPr>
-        <w:spacing w:after="0" w:before="90" w:line="240" w:lineRule="auto"/>
+        <w:spacing w:after="0" w:before="230" w:line="280" w:lineRule="auto"/>
       </w:pPr>
       <w:r>
         <w:rPr>
@@ -425,8 +426,8 @@
           <w:b/>
           <w:bCs/>
           <w:color w:val="0F1720"/>
-          <w:sz w:val="16"/>
-          <w:szCs w:val="16"/>
+          <w:sz w:val="17"/>
+          <w:szCs w:val="17"/>
         </w:rPr>
         <w:t xml:space="preserve">Where to get them: </w:t>
       </w:r>
@@ -434,15 +435,15 @@
         <w:rPr>
           <w:rFonts w:ascii="Arial" w:cs="Arial" w:eastAsia="Arial" w:hAnsi="Arial"/>
           <w:color w:val="55637A"/>
-          <w:sz w:val="16"/>
-          <w:szCs w:val="16"/>
+          <w:sz w:val="17"/>
+          <w:szCs w:val="17"/>
         </w:rPr>
         <w:t xml:space="preserve">Entra admin center → Identity → Users → All users → Download users. Microsoft 365 admin center → Copilot → Cost management → Consumption → Export CSV. Column names are auto-detected, so most export layouts work as-is.</w:t>
       </w:r>
     </w:p>
     <w:p>
       <w:pPr>
-        <w:spacing w:after="40" w:before="150"/>
+        <w:spacing w:after="130" w:before="420"/>
       </w:pPr>
       <w:r>
         <w:rPr>
@@ -452,8 +453,8 @@
           <w:caps/>
           <w:color w:val="0A3FB0"/>
           <w:spacing w:val="30"/>
-          <w:sz w:val="15"/>
-          <w:szCs w:val="15"/>
+          <w:sz w:val="16"/>
+          <w:szCs w:val="16"/>
         </w:rPr>
         <w:t xml:space="preserve">What you can do with it</w:t>
       </w:r>
@@ -486,15 +487,15 @@
               <w:right w:val="none" w:color="FFFFFF" w:sz="0"/>
             </w:tcBorders>
             <w:tcMar>
-              <w:top w:type="dxa" w:w="55"/>
+              <w:top w:type="dxa" w:w="170"/>
               <w:left w:type="dxa" w:w="0"/>
-              <w:bottom w:type="dxa" w:w="55"/>
-              <w:right w:type="dxa" w:w="160"/>
+              <w:bottom w:type="dxa" w:w="170"/>
+              <w:right w:type="dxa" w:w="200"/>
             </w:tcMar>
           </w:tcPr>
           <w:p>
             <w:pPr>
-              <w:spacing w:after="0" w:before="0" w:line="250" w:lineRule="auto"/>
+              <w:spacing w:after="0" w:before="0" w:line="290" w:lineRule="auto"/>
             </w:pPr>
             <w:r>
               <w:rPr>
@@ -502,8 +503,8 @@
                 <w:b/>
                 <w:bCs/>
                 <w:color w:val="0A3FB0"/>
-                <w:sz w:val="18"/>
-                <w:szCs w:val="18"/>
+                <w:sz w:val="19"/>
+                <w:szCs w:val="19"/>
               </w:rPr>
               <w:t xml:space="preserve">▪  </w:t>
             </w:r>
@@ -513,8 +514,8 @@
                 <w:b/>
                 <w:bCs/>
                 <w:color w:val="0F1720"/>
-                <w:sz w:val="18"/>
-                <w:szCs w:val="18"/>
+                <w:sz w:val="19"/>
+                <w:szCs w:val="19"/>
               </w:rPr>
               <w:t xml:space="preserve">Chargeback by department and user. </w:t>
             </w:r>
@@ -522,8 +523,8 @@
               <w:rPr>
                 <w:rFonts w:ascii="Arial" w:cs="Arial" w:eastAsia="Arial" w:hAnsi="Arial"/>
                 <w:color w:val="55637A"/>
-                <w:sz w:val="18"/>
-                <w:szCs w:val="18"/>
+                <w:sz w:val="19"/>
+                <w:szCs w:val="19"/>
               </w:rPr>
               <w:t xml:space="preserve">Every credit attributed and priced back to a cost center, down to the individual.</w:t>
             </w:r>
@@ -539,15 +540,15 @@
               <w:right w:val="none" w:color="FFFFFF" w:sz="0"/>
             </w:tcBorders>
             <w:tcMar>
-              <w:top w:type="dxa" w:w="55"/>
+              <w:top w:type="dxa" w:w="170"/>
               <w:left w:type="dxa" w:w="0"/>
-              <w:bottom w:type="dxa" w:w="55"/>
-              <w:right w:type="dxa" w:w="160"/>
+              <w:bottom w:type="dxa" w:w="170"/>
+              <w:right w:type="dxa" w:w="200"/>
             </w:tcMar>
           </w:tcPr>
           <w:p>
             <w:pPr>
-              <w:spacing w:after="0" w:before="0" w:line="250" w:lineRule="auto"/>
+              <w:spacing w:after="0" w:before="0" w:line="290" w:lineRule="auto"/>
             </w:pPr>
             <w:r>
               <w:rPr>
@@ -555,8 +556,8 @@
                 <w:b/>
                 <w:bCs/>
                 <w:color w:val="0A3FB0"/>
-                <w:sz w:val="18"/>
-                <w:szCs w:val="18"/>
+                <w:sz w:val="19"/>
+                <w:szCs w:val="19"/>
               </w:rPr>
               <w:t xml:space="preserve">▪  </w:t>
             </w:r>
@@ -566,8 +567,8 @@
                 <w:b/>
                 <w:bCs/>
                 <w:color w:val="0F1720"/>
-                <w:sz w:val="18"/>
-                <w:szCs w:val="18"/>
+                <w:sz w:val="19"/>
+                <w:szCs w:val="19"/>
               </w:rPr>
               <w:t xml:space="preserve">Allocate prepaid pools three ways. </w:t>
             </w:r>
@@ -575,8 +576,8 @@
               <w:rPr>
                 <w:rFonts w:ascii="Arial" w:cs="Arial" w:eastAsia="Arial" w:hAnsi="Arial"/>
                 <w:color w:val="55637A"/>
-                <w:sz w:val="18"/>
-                <w:szCs w:val="18"/>
+                <w:sz w:val="19"/>
+                <w:szCs w:val="19"/>
               </w:rPr>
               <w:t xml:space="preserve">Prorate by consumption, prorate by user count, or cap at budgeted allowances.</w:t>
             </w:r>
@@ -594,15 +595,15 @@
               <w:right w:val="none" w:color="FFFFFF" w:sz="0"/>
             </w:tcBorders>
             <w:tcMar>
-              <w:top w:type="dxa" w:w="55"/>
+              <w:top w:type="dxa" w:w="170"/>
               <w:left w:type="dxa" w:w="0"/>
-              <w:bottom w:type="dxa" w:w="55"/>
-              <w:right w:type="dxa" w:w="160"/>
+              <w:bottom w:type="dxa" w:w="170"/>
+              <w:right w:type="dxa" w:w="200"/>
             </w:tcMar>
           </w:tcPr>
           <w:p>
             <w:pPr>
-              <w:spacing w:after="0" w:before="0" w:line="250" w:lineRule="auto"/>
+              <w:spacing w:after="0" w:before="0" w:line="290" w:lineRule="auto"/>
             </w:pPr>
             <w:r>
               <w:rPr>
@@ -610,8 +611,8 @@
                 <w:b/>
                 <w:bCs/>
                 <w:color w:val="0A3FB0"/>
-                <w:sz w:val="18"/>
-                <w:szCs w:val="18"/>
+                <w:sz w:val="19"/>
+                <w:szCs w:val="19"/>
               </w:rPr>
               <w:t xml:space="preserve">▪  </w:t>
             </w:r>
@@ -621,8 +622,8 @@
                 <w:b/>
                 <w:bCs/>
                 <w:color w:val="0F1720"/>
-                <w:sz w:val="18"/>
-                <w:szCs w:val="18"/>
+                <w:sz w:val="19"/>
+                <w:szCs w:val="19"/>
               </w:rPr>
               <w:t xml:space="preserve">See consumption against limits. </w:t>
             </w:r>
@@ -630,8 +631,8 @@
               <w:rPr>
                 <w:rFonts w:ascii="Arial" w:cs="Arial" w:eastAsia="Arial" w:hAnsi="Arial"/>
                 <w:color w:val="55637A"/>
-                <w:sz w:val="18"/>
-                <w:szCs w:val="18"/>
+                <w:sz w:val="19"/>
+                <w:szCs w:val="19"/>
               </w:rPr>
               <w:t xml:space="preserve">Broken down by department and all the way down to individual users.</w:t>
             </w:r>
@@ -647,15 +648,15 @@
               <w:right w:val="none" w:color="FFFFFF" w:sz="0"/>
             </w:tcBorders>
             <w:tcMar>
-              <w:top w:type="dxa" w:w="55"/>
+              <w:top w:type="dxa" w:w="170"/>
               <w:left w:type="dxa" w:w="0"/>
-              <w:bottom w:type="dxa" w:w="55"/>
-              <w:right w:type="dxa" w:w="160"/>
+              <w:bottom w:type="dxa" w:w="170"/>
+              <w:right w:type="dxa" w:w="200"/>
             </w:tcMar>
           </w:tcPr>
           <w:p>
             <w:pPr>
-              <w:spacing w:after="0" w:before="0" w:line="250" w:lineRule="auto"/>
+              <w:spacing w:after="0" w:before="0" w:line="290" w:lineRule="auto"/>
             </w:pPr>
             <w:r>
               <w:rPr>
@@ -663,8 +664,8 @@
                 <w:b/>
                 <w:bCs/>
                 <w:color w:val="0A3FB0"/>
-                <w:sz w:val="18"/>
-                <w:szCs w:val="18"/>
+                <w:sz w:val="19"/>
+                <w:szCs w:val="19"/>
               </w:rPr>
               <w:t xml:space="preserve">▪  </w:t>
             </w:r>
@@ -674,8 +675,8 @@
                 <w:b/>
                 <w:bCs/>
                 <w:color w:val="0F1720"/>
-                <w:sz w:val="18"/>
-                <w:szCs w:val="18"/>
+                <w:sz w:val="19"/>
+                <w:szCs w:val="19"/>
               </w:rPr>
               <w:t xml:space="preserve">Right-size allocation. </w:t>
             </w:r>
@@ -683,8 +684,8 @@
               <w:rPr>
                 <w:rFonts w:ascii="Arial" w:cs="Arial" w:eastAsia="Arial" w:hAnsi="Arial"/>
                 <w:color w:val="55637A"/>
-                <w:sz w:val="18"/>
-                <w:szCs w:val="18"/>
+                <w:sz w:val="19"/>
+                <w:szCs w:val="19"/>
               </w:rPr>
               <w:t xml:space="preserve">Locate users over and under their limits and move capacity to who needs it.</w:t>
             </w:r>
@@ -702,15 +703,15 @@
               <w:right w:val="none" w:color="FFFFFF" w:sz="0"/>
             </w:tcBorders>
             <w:tcMar>
-              <w:top w:type="dxa" w:w="55"/>
+              <w:top w:type="dxa" w:w="170"/>
               <w:left w:type="dxa" w:w="0"/>
-              <w:bottom w:type="dxa" w:w="55"/>
-              <w:right w:type="dxa" w:w="160"/>
+              <w:bottom w:type="dxa" w:w="170"/>
+              <w:right w:type="dxa" w:w="200"/>
             </w:tcMar>
           </w:tcPr>
           <w:p>
             <w:pPr>
-              <w:spacing w:after="0" w:before="0" w:line="250" w:lineRule="auto"/>
+              <w:spacing w:after="0" w:before="0" w:line="290" w:lineRule="auto"/>
             </w:pPr>
             <w:r>
               <w:rPr>
@@ -718,8 +719,8 @@
                 <w:b/>
                 <w:bCs/>
                 <w:color w:val="0A3FB0"/>
-                <w:sz w:val="18"/>
-                <w:szCs w:val="18"/>
+                <w:sz w:val="19"/>
+                <w:szCs w:val="19"/>
               </w:rPr>
               <w:t xml:space="preserve">▪  </w:t>
             </w:r>
@@ -729,8 +730,8 @@
                 <w:b/>
                 <w:bCs/>
                 <w:color w:val="0F1720"/>
-                <w:sz w:val="18"/>
-                <w:szCs w:val="18"/>
+                <w:sz w:val="19"/>
+                <w:szCs w:val="19"/>
               </w:rPr>
               <w:t xml:space="preserve">Forecast future need. </w:t>
             </w:r>
@@ -738,8 +739,8 @@
               <w:rPr>
                 <w:rFonts w:ascii="Arial" w:cs="Arial" w:eastAsia="Arial" w:hAnsi="Arial"/>
                 <w:color w:val="55637A"/>
-                <w:sz w:val="18"/>
-                <w:szCs w:val="18"/>
+                <w:sz w:val="19"/>
+                <w:szCs w:val="19"/>
               </w:rPr>
               <w:t xml:space="preserve">Flexible growth rates and assumptions, projected against your committed pool.</w:t>
             </w:r>
@@ -755,15 +756,15 @@
               <w:right w:val="none" w:color="FFFFFF" w:sz="0"/>
             </w:tcBorders>
             <w:tcMar>
-              <w:top w:type="dxa" w:w="55"/>
+              <w:top w:type="dxa" w:w="170"/>
               <w:left w:type="dxa" w:w="0"/>
-              <w:bottom w:type="dxa" w:w="55"/>
-              <w:right w:type="dxa" w:w="160"/>
+              <w:bottom w:type="dxa" w:w="170"/>
+              <w:right w:type="dxa" w:w="200"/>
             </w:tcMar>
           </w:tcPr>
           <w:p>
             <w:pPr>
-              <w:spacing w:after="0" w:before="0" w:line="250" w:lineRule="auto"/>
+              <w:spacing w:after="0" w:before="0" w:line="290" w:lineRule="auto"/>
             </w:pPr>
             <w:r>
               <w:rPr>
@@ -771,8 +772,8 @@
                 <w:b/>
                 <w:bCs/>
                 <w:color w:val="0A3FB0"/>
-                <w:sz w:val="18"/>
-                <w:szCs w:val="18"/>
+                <w:sz w:val="19"/>
+                <w:szCs w:val="19"/>
               </w:rPr>
               <w:t xml:space="preserve">▪  </w:t>
             </w:r>
@@ -782,8 +783,8 @@
                 <w:b/>
                 <w:bCs/>
                 <w:color w:val="0F1720"/>
-                <w:sz w:val="18"/>
-                <w:szCs w:val="18"/>
+                <w:sz w:val="19"/>
+                <w:szCs w:val="19"/>
               </w:rPr>
               <w:t xml:space="preserve">FOCUS cost view. </w:t>
             </w:r>
@@ -791,8 +792,8 @@
               <w:rPr>
                 <w:rFonts w:ascii="Arial" w:cs="Arial" w:eastAsia="Arial" w:hAnsi="Arial"/>
                 <w:color w:val="55637A"/>
-                <w:sz w:val="18"/>
-                <w:szCs w:val="18"/>
+                <w:sz w:val="19"/>
+                <w:szCs w:val="19"/>
               </w:rPr>
               <w:t xml:space="preserve">A FinOps-standard appendix so Cowork sits alongside your other cloud spend.</w:t>
             </w:r>
@@ -800,6 +801,11 @@
         </w:tc>
       </w:tr>
     </w:tbl>
+    <w:p>
+      <w:pPr>
+        <w:spacing w:after="280"/>
+      </w:pPr>
+    </w:p>
     <w:tbl>
       <w:tblPr>
         <w:tblW w:type="dxa" w:w="9840"/>
@@ -820,15 +826,15 @@
           <w:tcPr>
             <w:shd w:fill="F5F8FD" w:color="auto" w:val="clear"/>
             <w:tcMar>
-              <w:top w:type="dxa" w:w="110"/>
-              <w:left w:type="dxa" w:w="200"/>
-              <w:bottom w:type="dxa" w:w="110"/>
-              <w:right w:type="dxa" w:w="200"/>
+              <w:top w:type="dxa" w:w="230"/>
+              <w:left w:type="dxa" w:w="260"/>
+              <w:bottom w:type="dxa" w:w="230"/>
+              <w:right w:type="dxa" w:w="260"/>
             </w:tcMar>
           </w:tcPr>
           <w:p>
             <w:pPr>
-              <w:spacing w:after="0" w:before="0" w:line="240" w:lineRule="auto"/>
+              <w:spacing w:after="0" w:before="0" w:line="280" w:lineRule="auto"/>
             </w:pPr>
             <w:r>
               <w:rPr>
@@ -836,8 +842,8 @@
                 <w:b/>
                 <w:bCs/>
                 <w:color w:val="0A3FB0"/>
-                <w:sz w:val="17"/>
-                <w:szCs w:val="17"/>
+                <w:sz w:val="18"/>
+                <w:szCs w:val="18"/>
               </w:rPr>
               <w:t xml:space="preserve">Runs in Power BI Desktop.  </w:t>
             </w:r>
@@ -845,8 +851,8 @@
               <w:rPr>
                 <w:rFonts w:ascii="Arial" w:cs="Arial" w:eastAsia="Arial" w:hAnsi="Arial"/>
                 <w:color w:val="3C4A44"/>
-                <w:sz w:val="17"/>
-                <w:szCs w:val="17"/>
+                <w:sz w:val="18"/>
+                <w:szCs w:val="18"/>
               </w:rPr>
               <w:t xml:space="preserve">Download the template, point it at your two CSVs and refresh. Nothing is published anywhere until you choose to publish it. Row-level security is not preconfigured: add it in your own workspace if each department lead should see only their own rows.</w:t>
             </w:r>
@@ -856,7 +862,7 @@
     </w:tbl>
     <w:p>
       <w:pPr>
-        <w:spacing w:after="90"/>
+        <w:spacing w:after="420"/>
       </w:pPr>
     </w:p>
     <w:tbl>
@@ -879,15 +885,15 @@
           <w:tcPr>
             <w:shd w:fill="101D3B" w:color="auto" w:val="clear"/>
             <w:tcMar>
-              <w:top w:type="dxa" w:w="110"/>
-              <w:left w:type="dxa" w:w="200"/>
-              <w:bottom w:type="dxa" w:w="110"/>
-              <w:right w:type="dxa" w:w="200"/>
+              <w:top w:type="dxa" w:w="230"/>
+              <w:left w:type="dxa" w:w="260"/>
+              <w:bottom w:type="dxa" w:w="230"/>
+              <w:right w:type="dxa" w:w="260"/>
             </w:tcMar>
           </w:tcPr>
           <w:p>
             <w:pPr>
-              <w:spacing w:after="0" w:before="0"/>
+              <w:spacing w:after="70" w:before="0" w:line="280" w:lineRule="auto"/>
             </w:pPr>
             <w:r>
               <w:rPr>
@@ -895,21 +901,26 @@
                 <w:b/>
                 <w:bCs/>
                 <w:color w:val="FFFFFF"/>
-                <w:sz w:val="18"/>
-                <w:szCs w:val="18"/>
+                <w:sz w:val="19"/>
+                <w:szCs w:val="19"/>
               </w:rPr>
               <w:t xml:space="preserve">Copilot Credit Consumption &amp; Cost — Templates, Tools &amp; Methodology</w:t>
             </w:r>
+          </w:p>
+          <w:p>
+            <w:pPr>
+              <w:spacing w:after="0" w:before="0" w:line="280" w:lineRule="auto"/>
+            </w:pPr>
             <w:r>
               <w:rPr>
                 <w:rFonts w:ascii="Arial" w:cs="Arial" w:eastAsia="Arial" w:hAnsi="Arial"/>
                 <w:b/>
                 <w:bCs/>
                 <w:color w:val="6FD8FF"/>
-                <w:sz w:val="17"/>
-                <w:szCs w:val="17"/>
-              </w:rPr>
-              <w:t xml:space="preserve">   microsoft.github.io/Analytics-Hub/cowork-billing</w:t>
+                <w:sz w:val="19"/>
+                <w:szCs w:val="19"/>
+              </w:rPr>
+              <w:t xml:space="preserve">microsoft.github.io/Analytics-Hub/cowork-billing</w:t>
             </w:r>
           </w:p>
         </w:tc>
@@ -917,7 +928,7 @@
     </w:tbl>
     <w:p>
       <w:pPr>
-        <w:spacing w:after="0" w:before="70" w:line="230" w:lineRule="auto"/>
+        <w:spacing w:after="0" w:before="200" w:line="260" w:lineRule="auto"/>
       </w:pPr>
       <w:r>
         <w:rPr>
@@ -925,8 +936,8 @@
           <w:i/>
           <w:iCs/>
           <w:color w:val="9AA6B6"/>
-          <w:sz w:val="14"/>
-          <w:szCs w:val="14"/>
+          <w:sz w:val="15"/>
+          <w:szCs w:val="15"/>
         </w:rPr>
         <w:t xml:space="preserve">Set the credit rate to your contracted rate before sharing any dollar figure; the shipped default is a placeholder, not your price. Figures are planning estimates, not a contracted agreement.</w:t>
       </w:r>

</xml_diff>